<commit_message>
docs(bl3): add threat model, DFD, ports, RGPD, SLA and contracting terms
</commit_message>
<xml_diff>
--- a/docs/BL3/CESIZen-Dossier-Maintenance.docx
+++ b/docs/BL3/CESIZen-Dossier-Maintenance.docx
@@ -1322,6 +1322,135 @@
         <w:t xml:space="preserve">7. Types de maintenance et engagements</w:t>
       </w:r>
     </w:p>
+    <w:p>
+      <w:pPr>
+        <w:pStyle w:val="Heading2"/>
+        <w:spacing w:after="120" w:before="220"/>
+      </w:pPr>
+      <w:r>
+        <w:rPr>
+          <w:b/>
+          <w:bCs/>
+          <w:color w:val="4B6B59"/>
+          <w:sz w:val="24"/>
+          <w:szCs w:val="24"/>
+        </w:rPr>
+        <w:t xml:space="preserve">7.1 Maintenance préventive</w:t>
+      </w:r>
+    </w:p>
+    <w:p>
+      <w:pPr>
+        <w:spacing w:after="120" w:line="276"/>
+      </w:pPr>
+      <w:r>
+        <w:rPr>
+          <w:sz w:val="21"/>
+          <w:szCs w:val="21"/>
+        </w:rPr>
+        <w:t xml:space="preserve">Anticiper les défaillances avant qu'elles ne surviennent. Incluse dans le forfait de maintenance.</w:t>
+      </w:r>
+    </w:p>
+    <w:p>
+      <w:pPr>
+        <w:pStyle w:val="ListParagraph"/>
+        <w:numPr>
+          <w:ilvl w:val="0"/>
+          <w:numId w:val="2"/>
+        </w:numPr>
+        <w:spacing w:after="80"/>
+      </w:pPr>
+      <w:r>
+        <w:rPr>
+          <w:sz w:val="21"/>
+          <w:szCs w:val="21"/>
+        </w:rPr>
+        <w:t xml:space="preserve">Mises à jour hebdomadaires des dépendances (Dependabot) sur les trois dépôts.</w:t>
+      </w:r>
+    </w:p>
+    <w:p>
+      <w:pPr>
+        <w:pStyle w:val="ListParagraph"/>
+        <w:numPr>
+          <w:ilvl w:val="0"/>
+          <w:numId w:val="2"/>
+        </w:numPr>
+        <w:spacing w:after="80"/>
+      </w:pPr>
+      <w:r>
+        <w:rPr>
+          <w:sz w:val="21"/>
+          <w:szCs w:val="21"/>
+        </w:rPr>
+        <w:t xml:space="preserve">Scans de sécurité nocturnes (Trivy, Gitleaks, OWASP Dependency Check).</w:t>
+      </w:r>
+    </w:p>
+    <w:p>
+      <w:pPr>
+        <w:pStyle w:val="ListParagraph"/>
+        <w:numPr>
+          <w:ilvl w:val="0"/>
+          <w:numId w:val="2"/>
+        </w:numPr>
+        <w:spacing w:after="80"/>
+      </w:pPr>
+      <w:r>
+        <w:rPr>
+          <w:sz w:val="21"/>
+          <w:szCs w:val="21"/>
+        </w:rPr>
+        <w:t xml:space="preserve">Revue mensuelle des journaux de connexion à la recherche d'anomalies.</w:t>
+      </w:r>
+    </w:p>
+    <w:p>
+      <w:pPr>
+        <w:pStyle w:val="ListParagraph"/>
+        <w:numPr>
+          <w:ilvl w:val="0"/>
+          <w:numId w:val="2"/>
+        </w:numPr>
+        <w:spacing w:after="80"/>
+      </w:pPr>
+      <w:r>
+        <w:rPr>
+          <w:sz w:val="21"/>
+          <w:szCs w:val="21"/>
+        </w:rPr>
+        <w:t xml:space="preserve">Vérification de la disponibilité via la sonde externe.</w:t>
+      </w:r>
+    </w:p>
+    <w:p>
+      <w:pPr>
+        <w:pStyle w:val="ListParagraph"/>
+        <w:numPr>
+          <w:ilvl w:val="0"/>
+          <w:numId w:val="2"/>
+        </w:numPr>
+        <w:spacing w:after="80"/>
+      </w:pPr>
+      <w:r>
+        <w:rPr>
+          <w:sz w:val="21"/>
+          <w:szCs w:val="21"/>
+        </w:rPr>
+        <w:t xml:space="preserve">Audit SonarCloud trimestriel.</w:t>
+      </w:r>
+    </w:p>
+    <w:p>
+      <w:pPr>
+        <w:pStyle w:val="Heading2"/>
+        <w:spacing w:after="120" w:before="220"/>
+      </w:pPr>
+      <w:r>
+        <w:rPr>
+          <w:b/>
+          <w:bCs/>
+          <w:color w:val="4B6B59"/>
+          <w:sz w:val="24"/>
+          <w:szCs w:val="24"/>
+        </w:rPr>
+        <w:t xml:space="preserve">7.2 Maintenance corrective</w:t>
+      </w:r>
+    </w:p>
     <w:tbl>
       <w:tblPr>
         <w:tblW w:type="dxa" w:w="9026"/>
@@ -1335,9 +1464,10 @@
         </w:tblBorders>
       </w:tblPr>
       <w:tblGrid>
-        <w:gridCol w:w="1800"/>
-        <w:gridCol w:w="4200"/>
-        <w:gridCol w:w="3026"/>
+        <w:gridCol w:w="1600"/>
+        <w:gridCol w:w="3400"/>
+        <w:gridCol w:w="2100"/>
+        <w:gridCol w:w="1926"/>
       </w:tblGrid>
       <w:tr>
         <w:trPr>
@@ -1345,7 +1475,7 @@
         </w:trPr>
         <w:tc>
           <w:tcPr>
-            <w:tcW w:type="dxa" w:w="1800"/>
+            <w:tcW w:type="dxa" w:w="1600"/>
             <w:tcBorders>
               <w:top w:val="single" w:color="C9D6CE" w:sz="2"/>
               <w:left w:val="single" w:color="C9D6CE" w:sz="2"/>
@@ -1369,13 +1499,13 @@
                 <w:sz w:val="19"/>
                 <w:szCs w:val="19"/>
               </w:rPr>
-              <w:t xml:space="preserve">Type</w:t>
-            </w:r>
-          </w:p>
-        </w:tc>
-        <w:tc>
-          <w:tcPr>
-            <w:tcW w:type="dxa" w:w="4200"/>
+              <w:t xml:space="preserve">Criticité</w:t>
+            </w:r>
+          </w:p>
+        </w:tc>
+        <w:tc>
+          <w:tcPr>
+            <w:tcW w:type="dxa" w:w="3400"/>
             <w:tcBorders>
               <w:top w:val="single" w:color="C9D6CE" w:sz="2"/>
               <w:left w:val="single" w:color="C9D6CE" w:sz="2"/>
@@ -1399,13 +1529,13 @@
                 <w:sz w:val="19"/>
                 <w:szCs w:val="19"/>
               </w:rPr>
-              <w:t xml:space="preserve">Périmètre</w:t>
-            </w:r>
-          </w:p>
-        </w:tc>
-        <w:tc>
-          <w:tcPr>
-            <w:tcW w:type="dxa" w:w="3026"/>
+              <w:t xml:space="preserve">Définition</w:t>
+            </w:r>
+          </w:p>
+        </w:tc>
+        <w:tc>
+          <w:tcPr>
+            <w:tcW w:type="dxa" w:w="2100"/>
             <w:tcBorders>
               <w:top w:val="single" w:color="C9D6CE" w:sz="2"/>
               <w:left w:val="single" w:color="C9D6CE" w:sz="2"/>
@@ -1429,7 +1559,37 @@
                 <w:sz w:val="19"/>
                 <w:szCs w:val="19"/>
               </w:rPr>
-              <w:t xml:space="preserve">Engagement indicatif</w:t>
+              <w:t xml:space="preserve">Prise en charge (SLA)</w:t>
+            </w:r>
+          </w:p>
+        </w:tc>
+        <w:tc>
+          <w:tcPr>
+            <w:tcW w:type="dxa" w:w="1926"/>
+            <w:tcBorders>
+              <w:top w:val="single" w:color="C9D6CE" w:sz="2"/>
+              <w:left w:val="single" w:color="C9D6CE" w:sz="2"/>
+              <w:bottom w:val="single" w:color="C9D6CE" w:sz="2"/>
+              <w:right w:val="single" w:color="C9D6CE" w:sz="2"/>
+            </w:tcBorders>
+            <w:shd w:fill="4B6B59" w:color="auto" w:val="clear"/>
+            <w:tcMar>
+              <w:top w:type="dxa" w:w="60"/>
+              <w:left w:type="dxa" w:w="100"/>
+              <w:bottom w:type="dxa" w:w="60"/>
+              <w:right w:type="dxa" w:w="100"/>
+            </w:tcMar>
+          </w:tcPr>
+          <w:p>
+            <w:r>
+              <w:rPr>
+                <w:b/>
+                <w:bCs/>
+                <w:color w:val="FFFFFF"/>
+                <w:sz w:val="19"/>
+                <w:szCs w:val="19"/>
+              </w:rPr>
+              <w:t xml:space="preserve">Résolution visée</w:t>
             </w:r>
           </w:p>
         </w:tc>
@@ -1437,79 +1597,105 @@
       <w:tr>
         <w:tc>
           <w:tcPr>
-            <w:tcW w:type="dxa" w:w="1800"/>
-            <w:tcBorders>
-              <w:top w:val="single" w:color="C9D6CE" w:sz="2"/>
-              <w:left w:val="single" w:color="C9D6CE" w:sz="2"/>
-              <w:bottom w:val="single" w:color="C9D6CE" w:sz="2"/>
-              <w:right w:val="single" w:color="C9D6CE" w:sz="2"/>
-            </w:tcBorders>
-            <w:tcMar>
-              <w:top w:type="dxa" w:w="50"/>
-              <w:left w:type="dxa" w:w="100"/>
-              <w:bottom w:type="dxa" w:w="50"/>
-              <w:right w:type="dxa" w:w="100"/>
-            </w:tcMar>
-          </w:tcPr>
-          <w:p>
-            <w:r>
-              <w:rPr>
-                <w:sz w:val="19"/>
-                <w:szCs w:val="19"/>
-              </w:rPr>
-              <w:t xml:space="preserve">Préventive</w:t>
-            </w:r>
-          </w:p>
-        </w:tc>
-        <w:tc>
-          <w:tcPr>
-            <w:tcW w:type="dxa" w:w="4200"/>
-            <w:tcBorders>
-              <w:top w:val="single" w:color="C9D6CE" w:sz="2"/>
-              <w:left w:val="single" w:color="C9D6CE" w:sz="2"/>
-              <w:bottom w:val="single" w:color="C9D6CE" w:sz="2"/>
-              <w:right w:val="single" w:color="C9D6CE" w:sz="2"/>
-            </w:tcBorders>
-            <w:tcMar>
-              <w:top w:type="dxa" w:w="50"/>
-              <w:left w:type="dxa" w:w="100"/>
-              <w:bottom w:type="dxa" w:w="50"/>
-              <w:right w:type="dxa" w:w="100"/>
-            </w:tcMar>
-          </w:tcPr>
-          <w:p>
-            <w:r>
-              <w:rPr>
-                <w:sz w:val="19"/>
-                <w:szCs w:val="19"/>
-              </w:rPr>
-              <w:t xml:space="preserve">Mises à jour hebdomadaires (Dependabot), revue des logs, scans nocturnes</w:t>
-            </w:r>
-          </w:p>
-        </w:tc>
-        <w:tc>
-          <w:tcPr>
-            <w:tcW w:type="dxa" w:w="3026"/>
-            <w:tcBorders>
-              <w:top w:val="single" w:color="C9D6CE" w:sz="2"/>
-              <w:left w:val="single" w:color="C9D6CE" w:sz="2"/>
-              <w:bottom w:val="single" w:color="C9D6CE" w:sz="2"/>
-              <w:right w:val="single" w:color="C9D6CE" w:sz="2"/>
-            </w:tcBorders>
-            <w:tcMar>
-              <w:top w:type="dxa" w:w="50"/>
-              <w:left w:type="dxa" w:w="100"/>
-              <w:bottom w:type="dxa" w:w="50"/>
-              <w:right w:type="dxa" w:w="100"/>
-            </w:tcMar>
-          </w:tcPr>
-          <w:p>
-            <w:r>
-              <w:rPr>
-                <w:sz w:val="19"/>
-                <w:szCs w:val="19"/>
-              </w:rPr>
-              <w:t xml:space="preserve">Continue</w:t>
+            <w:tcW w:type="dxa" w:w="1600"/>
+            <w:tcBorders>
+              <w:top w:val="single" w:color="C9D6CE" w:sz="2"/>
+              <w:left w:val="single" w:color="C9D6CE" w:sz="2"/>
+              <w:bottom w:val="single" w:color="C9D6CE" w:sz="2"/>
+              <w:right w:val="single" w:color="C9D6CE" w:sz="2"/>
+            </w:tcBorders>
+            <w:tcMar>
+              <w:top w:type="dxa" w:w="50"/>
+              <w:left w:type="dxa" w:w="100"/>
+              <w:bottom w:type="dxa" w:w="50"/>
+              <w:right w:type="dxa" w:w="100"/>
+            </w:tcMar>
+          </w:tcPr>
+          <w:p>
+            <w:r>
+              <w:rPr>
+                <w:sz w:val="19"/>
+                <w:szCs w:val="19"/>
+              </w:rPr>
+              <w:t xml:space="preserve">Bloquante</w:t>
+            </w:r>
+          </w:p>
+        </w:tc>
+        <w:tc>
+          <w:tcPr>
+            <w:tcW w:type="dxa" w:w="3400"/>
+            <w:tcBorders>
+              <w:top w:val="single" w:color="C9D6CE" w:sz="2"/>
+              <w:left w:val="single" w:color="C9D6CE" w:sz="2"/>
+              <w:bottom w:val="single" w:color="C9D6CE" w:sz="2"/>
+              <w:right w:val="single" w:color="C9D6CE" w:sz="2"/>
+            </w:tcBorders>
+            <w:tcMar>
+              <w:top w:type="dxa" w:w="50"/>
+              <w:left w:type="dxa" w:w="100"/>
+              <w:bottom w:type="dxa" w:w="50"/>
+              <w:right w:type="dxa" w:w="100"/>
+            </w:tcMar>
+          </w:tcPr>
+          <w:p>
+            <w:r>
+              <w:rPr>
+                <w:sz w:val="19"/>
+                <w:szCs w:val="19"/>
+              </w:rPr>
+              <w:t xml:space="preserve">Service indisponible ou faille exploitable</w:t>
+            </w:r>
+          </w:p>
+        </w:tc>
+        <w:tc>
+          <w:tcPr>
+            <w:tcW w:type="dxa" w:w="2100"/>
+            <w:tcBorders>
+              <w:top w:val="single" w:color="C9D6CE" w:sz="2"/>
+              <w:left w:val="single" w:color="C9D6CE" w:sz="2"/>
+              <w:bottom w:val="single" w:color="C9D6CE" w:sz="2"/>
+              <w:right w:val="single" w:color="C9D6CE" w:sz="2"/>
+            </w:tcBorders>
+            <w:tcMar>
+              <w:top w:type="dxa" w:w="50"/>
+              <w:left w:type="dxa" w:w="100"/>
+              <w:bottom w:type="dxa" w:w="50"/>
+              <w:right w:type="dxa" w:w="100"/>
+            </w:tcMar>
+          </w:tcPr>
+          <w:p>
+            <w:r>
+              <w:rPr>
+                <w:sz w:val="19"/>
+                <w:szCs w:val="19"/>
+              </w:rPr>
+              <w:t xml:space="preserve">4 heures ouvrées</w:t>
+            </w:r>
+          </w:p>
+        </w:tc>
+        <w:tc>
+          <w:tcPr>
+            <w:tcW w:type="dxa" w:w="1926"/>
+            <w:tcBorders>
+              <w:top w:val="single" w:color="C9D6CE" w:sz="2"/>
+              <w:left w:val="single" w:color="C9D6CE" w:sz="2"/>
+              <w:bottom w:val="single" w:color="C9D6CE" w:sz="2"/>
+              <w:right w:val="single" w:color="C9D6CE" w:sz="2"/>
+            </w:tcBorders>
+            <w:tcMar>
+              <w:top w:type="dxa" w:w="50"/>
+              <w:left w:type="dxa" w:w="100"/>
+              <w:bottom w:type="dxa" w:w="50"/>
+              <w:right w:type="dxa" w:w="100"/>
+            </w:tcMar>
+          </w:tcPr>
+          <w:p>
+            <w:r>
+              <w:rPr>
+                <w:sz w:val="19"/>
+                <w:szCs w:val="19"/>
+              </w:rPr>
+              <w:t xml:space="preserve">24 heures</w:t>
             </w:r>
           </w:p>
         </w:tc>
@@ -1517,7 +1703,7 @@
       <w:tr>
         <w:tc>
           <w:tcPr>
-            <w:tcW w:type="dxa" w:w="1800"/>
+            <w:tcW w:type="dxa" w:w="1600"/>
             <w:tcBorders>
               <w:top w:val="single" w:color="C9D6CE" w:sz="2"/>
               <w:left w:val="single" w:color="C9D6CE" w:sz="2"/>
@@ -1538,13 +1724,13 @@
                 <w:sz w:val="19"/>
                 <w:szCs w:val="19"/>
               </w:rPr>
-              <w:t xml:space="preserve">Corrective</w:t>
-            </w:r>
-          </w:p>
-        </w:tc>
-        <w:tc>
-          <w:tcPr>
-            <w:tcW w:type="dxa" w:w="4200"/>
+              <w:t xml:space="preserve">Majeure</w:t>
+            </w:r>
+          </w:p>
+        </w:tc>
+        <w:tc>
+          <w:tcPr>
+            <w:tcW w:type="dxa" w:w="3400"/>
             <w:tcBorders>
               <w:top w:val="single" w:color="C9D6CE" w:sz="2"/>
               <w:left w:val="single" w:color="C9D6CE" w:sz="2"/>
@@ -1565,13 +1751,13 @@
                 <w:sz w:val="19"/>
                 <w:szCs w:val="19"/>
               </w:rPr>
-              <w:t xml:space="preserve">Bugs introduits par les développements CESIZen</w:t>
-            </w:r>
-          </w:p>
-        </w:tc>
-        <w:tc>
-          <w:tcPr>
-            <w:tcW w:type="dxa" w:w="3026"/>
+              <w:t xml:space="preserve">Fonctionnalité inutilisable, sans contournement</w:t>
+            </w:r>
+          </w:p>
+        </w:tc>
+        <w:tc>
+          <w:tcPr>
+            <w:tcW w:type="dxa" w:w="2100"/>
             <w:tcBorders>
               <w:top w:val="single" w:color="C9D6CE" w:sz="2"/>
               <w:left w:val="single" w:color="C9D6CE" w:sz="2"/>
@@ -1592,7 +1778,34 @@
                 <w:sz w:val="19"/>
                 <w:szCs w:val="19"/>
               </w:rPr>
-              <w:t xml:space="preserve">Critique &lt; 24 h · Majeur &lt; 72 h · Mineur : prochaine release</w:t>
+              <w:t xml:space="preserve">1 jour ouvré</w:t>
+            </w:r>
+          </w:p>
+        </w:tc>
+        <w:tc>
+          <w:tcPr>
+            <w:tcW w:type="dxa" w:w="1926"/>
+            <w:tcBorders>
+              <w:top w:val="single" w:color="C9D6CE" w:sz="2"/>
+              <w:left w:val="single" w:color="C9D6CE" w:sz="2"/>
+              <w:bottom w:val="single" w:color="C9D6CE" w:sz="2"/>
+              <w:right w:val="single" w:color="C9D6CE" w:sz="2"/>
+            </w:tcBorders>
+            <w:shd w:fill="E8EFEA" w:color="auto" w:val="clear"/>
+            <w:tcMar>
+              <w:top w:type="dxa" w:w="50"/>
+              <w:left w:type="dxa" w:w="100"/>
+              <w:bottom w:type="dxa" w:w="50"/>
+              <w:right w:type="dxa" w:w="100"/>
+            </w:tcMar>
+          </w:tcPr>
+          <w:p>
+            <w:r>
+              <w:rPr>
+                <w:sz w:val="19"/>
+                <w:szCs w:val="19"/>
+              </w:rPr>
+              <w:t xml:space="preserve">72 heures</w:t>
             </w:r>
           </w:p>
         </w:tc>
@@ -1600,79 +1813,215 @@
       <w:tr>
         <w:tc>
           <w:tcPr>
-            <w:tcW w:type="dxa" w:w="1800"/>
-            <w:tcBorders>
-              <w:top w:val="single" w:color="C9D6CE" w:sz="2"/>
-              <w:left w:val="single" w:color="C9D6CE" w:sz="2"/>
-              <w:bottom w:val="single" w:color="C9D6CE" w:sz="2"/>
-              <w:right w:val="single" w:color="C9D6CE" w:sz="2"/>
-            </w:tcBorders>
-            <w:tcMar>
-              <w:top w:type="dxa" w:w="50"/>
-              <w:left w:type="dxa" w:w="100"/>
-              <w:bottom w:type="dxa" w:w="50"/>
-              <w:right w:type="dxa" w:w="100"/>
-            </w:tcMar>
-          </w:tcPr>
-          <w:p>
-            <w:r>
-              <w:rPr>
-                <w:sz w:val="19"/>
-                <w:szCs w:val="19"/>
-              </w:rPr>
-              <w:t xml:space="preserve">Évolutive</w:t>
-            </w:r>
-          </w:p>
-        </w:tc>
-        <w:tc>
-          <w:tcPr>
-            <w:tcW w:type="dxa" w:w="4200"/>
-            <w:tcBorders>
-              <w:top w:val="single" w:color="C9D6CE" w:sz="2"/>
-              <w:left w:val="single" w:color="C9D6CE" w:sz="2"/>
-              <w:bottom w:val="single" w:color="C9D6CE" w:sz="2"/>
-              <w:right w:val="single" w:color="C9D6CE" w:sz="2"/>
-            </w:tcBorders>
-            <w:tcMar>
-              <w:top w:type="dxa" w:w="50"/>
-              <w:left w:type="dxa" w:w="100"/>
-              <w:bottom w:type="dxa" w:w="50"/>
-              <w:right w:type="dxa" w:w="100"/>
-            </w:tcMar>
-          </w:tcPr>
-          <w:p>
-            <w:r>
-              <w:rPr>
-                <w:sz w:val="19"/>
-                <w:szCs w:val="19"/>
-              </w:rPr>
-              <w:t xml:space="preserve">Nouvelles fonctionnalités via issue + PR + revue</w:t>
-            </w:r>
-          </w:p>
-        </w:tc>
-        <w:tc>
-          <w:tcPr>
-            <w:tcW w:type="dxa" w:w="3026"/>
-            <w:tcBorders>
-              <w:top w:val="single" w:color="C9D6CE" w:sz="2"/>
-              <w:left w:val="single" w:color="C9D6CE" w:sz="2"/>
-              <w:bottom w:val="single" w:color="C9D6CE" w:sz="2"/>
-              <w:right w:val="single" w:color="C9D6CE" w:sz="2"/>
-            </w:tcBorders>
-            <w:tcMar>
-              <w:top w:type="dxa" w:w="50"/>
-              <w:left w:type="dxa" w:w="100"/>
-              <w:bottom w:type="dxa" w:w="50"/>
-              <w:right w:type="dxa" w:w="100"/>
-            </w:tcMar>
-          </w:tcPr>
-          <w:p>
-            <w:r>
-              <w:rPr>
-                <w:sz w:val="19"/>
-                <w:szCs w:val="19"/>
-              </w:rPr>
-              <w:t xml:space="preserve">Priorisation par milestone</w:t>
+            <w:tcW w:type="dxa" w:w="1600"/>
+            <w:tcBorders>
+              <w:top w:val="single" w:color="C9D6CE" w:sz="2"/>
+              <w:left w:val="single" w:color="C9D6CE" w:sz="2"/>
+              <w:bottom w:val="single" w:color="C9D6CE" w:sz="2"/>
+              <w:right w:val="single" w:color="C9D6CE" w:sz="2"/>
+            </w:tcBorders>
+            <w:tcMar>
+              <w:top w:type="dxa" w:w="50"/>
+              <w:left w:type="dxa" w:w="100"/>
+              <w:bottom w:type="dxa" w:w="50"/>
+              <w:right w:type="dxa" w:w="100"/>
+            </w:tcMar>
+          </w:tcPr>
+          <w:p>
+            <w:r>
+              <w:rPr>
+                <w:sz w:val="19"/>
+                <w:szCs w:val="19"/>
+              </w:rPr>
+              <w:t xml:space="preserve">Mineure</w:t>
+            </w:r>
+          </w:p>
+        </w:tc>
+        <w:tc>
+          <w:tcPr>
+            <w:tcW w:type="dxa" w:w="3400"/>
+            <w:tcBorders>
+              <w:top w:val="single" w:color="C9D6CE" w:sz="2"/>
+              <w:left w:val="single" w:color="C9D6CE" w:sz="2"/>
+              <w:bottom w:val="single" w:color="C9D6CE" w:sz="2"/>
+              <w:right w:val="single" w:color="C9D6CE" w:sz="2"/>
+            </w:tcBorders>
+            <w:tcMar>
+              <w:top w:type="dxa" w:w="50"/>
+              <w:left w:type="dxa" w:w="100"/>
+              <w:bottom w:type="dxa" w:w="50"/>
+              <w:right w:type="dxa" w:w="100"/>
+            </w:tcMar>
+          </w:tcPr>
+          <w:p>
+            <w:r>
+              <w:rPr>
+                <w:sz w:val="19"/>
+                <w:szCs w:val="19"/>
+              </w:rPr>
+              <w:t xml:space="preserve">Anomalie avec contournement possible</w:t>
+            </w:r>
+          </w:p>
+        </w:tc>
+        <w:tc>
+          <w:tcPr>
+            <w:tcW w:type="dxa" w:w="2100"/>
+            <w:tcBorders>
+              <w:top w:val="single" w:color="C9D6CE" w:sz="2"/>
+              <w:left w:val="single" w:color="C9D6CE" w:sz="2"/>
+              <w:bottom w:val="single" w:color="C9D6CE" w:sz="2"/>
+              <w:right w:val="single" w:color="C9D6CE" w:sz="2"/>
+            </w:tcBorders>
+            <w:tcMar>
+              <w:top w:type="dxa" w:w="50"/>
+              <w:left w:type="dxa" w:w="100"/>
+              <w:bottom w:type="dxa" w:w="50"/>
+              <w:right w:type="dxa" w:w="100"/>
+            </w:tcMar>
+          </w:tcPr>
+          <w:p>
+            <w:r>
+              <w:rPr>
+                <w:sz w:val="19"/>
+                <w:szCs w:val="19"/>
+              </w:rPr>
+              <w:t xml:space="preserve">3 jours ouvrés</w:t>
+            </w:r>
+          </w:p>
+        </w:tc>
+        <w:tc>
+          <w:tcPr>
+            <w:tcW w:type="dxa" w:w="1926"/>
+            <w:tcBorders>
+              <w:top w:val="single" w:color="C9D6CE" w:sz="2"/>
+              <w:left w:val="single" w:color="C9D6CE" w:sz="2"/>
+              <w:bottom w:val="single" w:color="C9D6CE" w:sz="2"/>
+              <w:right w:val="single" w:color="C9D6CE" w:sz="2"/>
+            </w:tcBorders>
+            <w:tcMar>
+              <w:top w:type="dxa" w:w="50"/>
+              <w:left w:type="dxa" w:w="100"/>
+              <w:bottom w:type="dxa" w:w="50"/>
+              <w:right w:type="dxa" w:w="100"/>
+            </w:tcMar>
+          </w:tcPr>
+          <w:p>
+            <w:r>
+              <w:rPr>
+                <w:sz w:val="19"/>
+                <w:szCs w:val="19"/>
+              </w:rPr>
+              <w:t xml:space="preserve">Prochaine version</w:t>
+            </w:r>
+          </w:p>
+        </w:tc>
+      </w:tr>
+      <w:tr>
+        <w:tc>
+          <w:tcPr>
+            <w:tcW w:type="dxa" w:w="1600"/>
+            <w:tcBorders>
+              <w:top w:val="single" w:color="C9D6CE" w:sz="2"/>
+              <w:left w:val="single" w:color="C9D6CE" w:sz="2"/>
+              <w:bottom w:val="single" w:color="C9D6CE" w:sz="2"/>
+              <w:right w:val="single" w:color="C9D6CE" w:sz="2"/>
+            </w:tcBorders>
+            <w:shd w:fill="E8EFEA" w:color="auto" w:val="clear"/>
+            <w:tcMar>
+              <w:top w:type="dxa" w:w="50"/>
+              <w:left w:type="dxa" w:w="100"/>
+              <w:bottom w:type="dxa" w:w="50"/>
+              <w:right w:type="dxa" w:w="100"/>
+            </w:tcMar>
+          </w:tcPr>
+          <w:p>
+            <w:r>
+              <w:rPr>
+                <w:sz w:val="19"/>
+                <w:szCs w:val="19"/>
+              </w:rPr>
+              <w:t xml:space="preserve">Cosmétique</w:t>
+            </w:r>
+          </w:p>
+        </w:tc>
+        <w:tc>
+          <w:tcPr>
+            <w:tcW w:type="dxa" w:w="3400"/>
+            <w:tcBorders>
+              <w:top w:val="single" w:color="C9D6CE" w:sz="2"/>
+              <w:left w:val="single" w:color="C9D6CE" w:sz="2"/>
+              <w:bottom w:val="single" w:color="C9D6CE" w:sz="2"/>
+              <w:right w:val="single" w:color="C9D6CE" w:sz="2"/>
+            </w:tcBorders>
+            <w:shd w:fill="E8EFEA" w:color="auto" w:val="clear"/>
+            <w:tcMar>
+              <w:top w:type="dxa" w:w="50"/>
+              <w:left w:type="dxa" w:w="100"/>
+              <w:bottom w:type="dxa" w:w="50"/>
+              <w:right w:type="dxa" w:w="100"/>
+            </w:tcMar>
+          </w:tcPr>
+          <w:p>
+            <w:r>
+              <w:rPr>
+                <w:sz w:val="19"/>
+                <w:szCs w:val="19"/>
+              </w:rPr>
+              <w:t xml:space="preserve">Défaut d'affichage sans impact fonctionnel</w:t>
+            </w:r>
+          </w:p>
+        </w:tc>
+        <w:tc>
+          <w:tcPr>
+            <w:tcW w:type="dxa" w:w="2100"/>
+            <w:tcBorders>
+              <w:top w:val="single" w:color="C9D6CE" w:sz="2"/>
+              <w:left w:val="single" w:color="C9D6CE" w:sz="2"/>
+              <w:bottom w:val="single" w:color="C9D6CE" w:sz="2"/>
+              <w:right w:val="single" w:color="C9D6CE" w:sz="2"/>
+            </w:tcBorders>
+            <w:shd w:fill="E8EFEA" w:color="auto" w:val="clear"/>
+            <w:tcMar>
+              <w:top w:type="dxa" w:w="50"/>
+              <w:left w:type="dxa" w:w="100"/>
+              <w:bottom w:type="dxa" w:w="50"/>
+              <w:right w:type="dxa" w:w="100"/>
+            </w:tcMar>
+          </w:tcPr>
+          <w:p>
+            <w:r>
+              <w:rPr>
+                <w:sz w:val="19"/>
+                <w:szCs w:val="19"/>
+              </w:rPr>
+              <w:t xml:space="preserve">—</w:t>
+            </w:r>
+          </w:p>
+        </w:tc>
+        <w:tc>
+          <w:tcPr>
+            <w:tcW w:type="dxa" w:w="1926"/>
+            <w:tcBorders>
+              <w:top w:val="single" w:color="C9D6CE" w:sz="2"/>
+              <w:left w:val="single" w:color="C9D6CE" w:sz="2"/>
+              <w:bottom w:val="single" w:color="C9D6CE" w:sz="2"/>
+              <w:right w:val="single" w:color="C9D6CE" w:sz="2"/>
+            </w:tcBorders>
+            <w:shd w:fill="E8EFEA" w:color="auto" w:val="clear"/>
+            <w:tcMar>
+              <w:top w:type="dxa" w:w="50"/>
+              <w:left w:type="dxa" w:w="100"/>
+              <w:bottom w:type="dxa" w:w="50"/>
+              <w:right w:type="dxa" w:w="100"/>
+            </w:tcMar>
+          </w:tcPr>
+          <w:p>
+            <w:r>
+              <w:rPr>
+                <w:sz w:val="19"/>
+                <w:szCs w:val="19"/>
+              </w:rPr>
+              <w:t xml:space="preserve">Selon disponibilité</w:t>
             </w:r>
           </w:p>
         </w:tc>
@@ -1689,14 +2038,552 @@
           <w:sz w:val="21"/>
           <w:szCs w:val="21"/>
         </w:rPr>
-        <w:t xml:space="preserve">Hors périmètre corrective. </w:t>
-      </w:r>
-      <w:r>
-        <w:rPr>
-          <w:sz w:val="21"/>
-          <w:szCs w:val="21"/>
-        </w:rPr>
-        <w:t xml:space="preserve">Pannes de l'hébergeur, failles de composants tiers non encore patchés en amont, indisponibilités de services externes (Vercel, Supabase).</w:t>
+        <w:t xml:space="preserve">Dans le périmètre : </w:t>
+      </w:r>
+      <w:r>
+        <w:rPr>
+          <w:sz w:val="21"/>
+          <w:szCs w:val="21"/>
+        </w:rPr>
+        <w:t xml:space="preserve">bugs introduits par les développements réalisés sur CESIZen.</w:t>
+      </w:r>
+    </w:p>
+    <w:p>
+      <w:pPr>
+        <w:spacing w:after="120" w:line="276"/>
+      </w:pPr>
+      <w:r>
+        <w:rPr>
+          <w:b/>
+          <w:bCs/>
+          <w:sz w:val="21"/>
+          <w:szCs w:val="21"/>
+        </w:rPr>
+        <w:t xml:space="preserve">Hors périmètre : </w:t>
+      </w:r>
+      <w:r>
+        <w:rPr>
+          <w:sz w:val="21"/>
+          <w:szCs w:val="21"/>
+        </w:rPr>
+        <w:t xml:space="preserve">pannes de l'hébergeur, failles de composants tiers non encore corrigées en amont, indisponibilités de services externes (Vercel, Supabase), et toute anomalie causée par une modification effectuée par le client.</w:t>
+      </w:r>
+    </w:p>
+    <w:p>
+      <w:pPr>
+        <w:pStyle w:val="Heading2"/>
+        <w:spacing w:after="120" w:before="220"/>
+      </w:pPr>
+      <w:r>
+        <w:rPr>
+          <w:b/>
+          <w:bCs/>
+          <w:color w:val="4B6B59"/>
+          <w:sz w:val="24"/>
+          <w:szCs w:val="24"/>
+        </w:rPr>
+        <w:t xml:space="preserve">7.3 Maintenance évolutive</w:t>
+      </w:r>
+    </w:p>
+    <w:p>
+      <w:pPr>
+        <w:spacing w:after="120" w:line="276"/>
+      </w:pPr>
+      <w:r>
+        <w:rPr>
+          <w:sz w:val="21"/>
+          <w:szCs w:val="21"/>
+        </w:rPr>
+        <w:t xml:space="preserve">Ajout de fonctionnalités ou adaptation à un nouveau besoin. Facturée au temps passé, hors forfait.</w:t>
+      </w:r>
+    </w:p>
+    <w:tbl>
+      <w:tblPr>
+        <w:tblW w:type="dxa" w:w="9026"/>
+        <w:tblBorders>
+          <w:top w:val="single" w:color="auto" w:sz="4"/>
+          <w:left w:val="single" w:color="auto" w:sz="4"/>
+          <w:bottom w:val="single" w:color="auto" w:sz="4"/>
+          <w:right w:val="single" w:color="auto" w:sz="4"/>
+          <w:insideH w:val="single" w:color="auto" w:sz="4"/>
+          <w:insideV w:val="single" w:color="auto" w:sz="4"/>
+        </w:tblBorders>
+      </w:tblPr>
+      <w:tblGrid>
+        <w:gridCol w:w="5000"/>
+        <w:gridCol w:w="4026"/>
+      </w:tblGrid>
+      <w:tr>
+        <w:trPr>
+          <w:tblHeader/>
+        </w:trPr>
+        <w:tc>
+          <w:tcPr>
+            <w:tcW w:type="dxa" w:w="5000"/>
+            <w:tcBorders>
+              <w:top w:val="single" w:color="C9D6CE" w:sz="2"/>
+              <w:left w:val="single" w:color="C9D6CE" w:sz="2"/>
+              <w:bottom w:val="single" w:color="C9D6CE" w:sz="2"/>
+              <w:right w:val="single" w:color="C9D6CE" w:sz="2"/>
+            </w:tcBorders>
+            <w:shd w:fill="4B6B59" w:color="auto" w:val="clear"/>
+            <w:tcMar>
+              <w:top w:type="dxa" w:w="60"/>
+              <w:left w:type="dxa" w:w="100"/>
+              <w:bottom w:type="dxa" w:w="60"/>
+              <w:right w:type="dxa" w:w="100"/>
+            </w:tcMar>
+          </w:tcPr>
+          <w:p>
+            <w:r>
+              <w:rPr>
+                <w:b/>
+                <w:bCs/>
+                <w:color w:val="FFFFFF"/>
+                <w:sz w:val="19"/>
+                <w:szCs w:val="19"/>
+              </w:rPr>
+              <w:t xml:space="preserve">Élément</w:t>
+            </w:r>
+          </w:p>
+        </w:tc>
+        <w:tc>
+          <w:tcPr>
+            <w:tcW w:type="dxa" w:w="4026"/>
+            <w:tcBorders>
+              <w:top w:val="single" w:color="C9D6CE" w:sz="2"/>
+              <w:left w:val="single" w:color="C9D6CE" w:sz="2"/>
+              <w:bottom w:val="single" w:color="C9D6CE" w:sz="2"/>
+              <w:right w:val="single" w:color="C9D6CE" w:sz="2"/>
+            </w:tcBorders>
+            <w:shd w:fill="4B6B59" w:color="auto" w:val="clear"/>
+            <w:tcMar>
+              <w:top w:type="dxa" w:w="60"/>
+              <w:left w:type="dxa" w:w="100"/>
+              <w:bottom w:type="dxa" w:w="60"/>
+              <w:right w:type="dxa" w:w="100"/>
+            </w:tcMar>
+          </w:tcPr>
+          <w:p>
+            <w:r>
+              <w:rPr>
+                <w:b/>
+                <w:bCs/>
+                <w:color w:val="FFFFFF"/>
+                <w:sz w:val="19"/>
+                <w:szCs w:val="19"/>
+              </w:rPr>
+              <w:t xml:space="preserve">Valeur indicative</w:t>
+            </w:r>
+          </w:p>
+        </w:tc>
+      </w:tr>
+      <w:tr>
+        <w:tc>
+          <w:tcPr>
+            <w:tcW w:type="dxa" w:w="5000"/>
+            <w:tcBorders>
+              <w:top w:val="single" w:color="C9D6CE" w:sz="2"/>
+              <w:left w:val="single" w:color="C9D6CE" w:sz="2"/>
+              <w:bottom w:val="single" w:color="C9D6CE" w:sz="2"/>
+              <w:right w:val="single" w:color="C9D6CE" w:sz="2"/>
+            </w:tcBorders>
+            <w:tcMar>
+              <w:top w:type="dxa" w:w="50"/>
+              <w:left w:type="dxa" w:w="100"/>
+              <w:bottom w:type="dxa" w:w="50"/>
+              <w:right w:type="dxa" w:w="100"/>
+            </w:tcMar>
+          </w:tcPr>
+          <w:p>
+            <w:r>
+              <w:rPr>
+                <w:sz w:val="19"/>
+                <w:szCs w:val="19"/>
+              </w:rPr>
+              <w:t xml:space="preserve">Tarif journalier moyen (TJM) — développeur</w:t>
+            </w:r>
+          </w:p>
+        </w:tc>
+        <w:tc>
+          <w:tcPr>
+            <w:tcW w:type="dxa" w:w="4026"/>
+            <w:tcBorders>
+              <w:top w:val="single" w:color="C9D6CE" w:sz="2"/>
+              <w:left w:val="single" w:color="C9D6CE" w:sz="2"/>
+              <w:bottom w:val="single" w:color="C9D6CE" w:sz="2"/>
+              <w:right w:val="single" w:color="C9D6CE" w:sz="2"/>
+            </w:tcBorders>
+            <w:tcMar>
+              <w:top w:type="dxa" w:w="50"/>
+              <w:left w:type="dxa" w:w="100"/>
+              <w:bottom w:type="dxa" w:w="50"/>
+              <w:right w:type="dxa" w:w="100"/>
+            </w:tcMar>
+          </w:tcPr>
+          <w:p>
+            <w:r>
+              <w:rPr>
+                <w:sz w:val="19"/>
+                <w:szCs w:val="19"/>
+              </w:rPr>
+              <w:t xml:space="preserve">450 € HT / jour</w:t>
+            </w:r>
+          </w:p>
+        </w:tc>
+      </w:tr>
+      <w:tr>
+        <w:tc>
+          <w:tcPr>
+            <w:tcW w:type="dxa" w:w="5000"/>
+            <w:tcBorders>
+              <w:top w:val="single" w:color="C9D6CE" w:sz="2"/>
+              <w:left w:val="single" w:color="C9D6CE" w:sz="2"/>
+              <w:bottom w:val="single" w:color="C9D6CE" w:sz="2"/>
+              <w:right w:val="single" w:color="C9D6CE" w:sz="2"/>
+            </w:tcBorders>
+            <w:shd w:fill="E8EFEA" w:color="auto" w:val="clear"/>
+            <w:tcMar>
+              <w:top w:type="dxa" w:w="50"/>
+              <w:left w:type="dxa" w:w="100"/>
+              <w:bottom w:type="dxa" w:w="50"/>
+              <w:right w:type="dxa" w:w="100"/>
+            </w:tcMar>
+          </w:tcPr>
+          <w:p>
+            <w:r>
+              <w:rPr>
+                <w:sz w:val="19"/>
+                <w:szCs w:val="19"/>
+              </w:rPr>
+              <w:t xml:space="preserve">Tarif journalier moyen (TJM) — chef de projet</w:t>
+            </w:r>
+          </w:p>
+        </w:tc>
+        <w:tc>
+          <w:tcPr>
+            <w:tcW w:type="dxa" w:w="4026"/>
+            <w:tcBorders>
+              <w:top w:val="single" w:color="C9D6CE" w:sz="2"/>
+              <w:left w:val="single" w:color="C9D6CE" w:sz="2"/>
+              <w:bottom w:val="single" w:color="C9D6CE" w:sz="2"/>
+              <w:right w:val="single" w:color="C9D6CE" w:sz="2"/>
+            </w:tcBorders>
+            <w:shd w:fill="E8EFEA" w:color="auto" w:val="clear"/>
+            <w:tcMar>
+              <w:top w:type="dxa" w:w="50"/>
+              <w:left w:type="dxa" w:w="100"/>
+              <w:bottom w:type="dxa" w:w="50"/>
+              <w:right w:type="dxa" w:w="100"/>
+            </w:tcMar>
+          </w:tcPr>
+          <w:p>
+            <w:r>
+              <w:rPr>
+                <w:sz w:val="19"/>
+                <w:szCs w:val="19"/>
+              </w:rPr>
+              <w:t xml:space="preserve">600 € HT / jour</w:t>
+            </w:r>
+          </w:p>
+        </w:tc>
+      </w:tr>
+      <w:tr>
+        <w:tc>
+          <w:tcPr>
+            <w:tcW w:type="dxa" w:w="5000"/>
+            <w:tcBorders>
+              <w:top w:val="single" w:color="C9D6CE" w:sz="2"/>
+              <w:left w:val="single" w:color="C9D6CE" w:sz="2"/>
+              <w:bottom w:val="single" w:color="C9D6CE" w:sz="2"/>
+              <w:right w:val="single" w:color="C9D6CE" w:sz="2"/>
+            </w:tcBorders>
+            <w:tcMar>
+              <w:top w:type="dxa" w:w="50"/>
+              <w:left w:type="dxa" w:w="100"/>
+              <w:bottom w:type="dxa" w:w="50"/>
+              <w:right w:type="dxa" w:w="100"/>
+            </w:tcMar>
+          </w:tcPr>
+          <w:p>
+            <w:r>
+              <w:rPr>
+                <w:sz w:val="19"/>
+                <w:szCs w:val="19"/>
+              </w:rPr>
+              <w:t xml:space="preserve">Unité de facturation minimale</w:t>
+            </w:r>
+          </w:p>
+        </w:tc>
+        <w:tc>
+          <w:tcPr>
+            <w:tcW w:type="dxa" w:w="4026"/>
+            <w:tcBorders>
+              <w:top w:val="single" w:color="C9D6CE" w:sz="2"/>
+              <w:left w:val="single" w:color="C9D6CE" w:sz="2"/>
+              <w:bottom w:val="single" w:color="C9D6CE" w:sz="2"/>
+              <w:right w:val="single" w:color="C9D6CE" w:sz="2"/>
+            </w:tcBorders>
+            <w:tcMar>
+              <w:top w:type="dxa" w:w="50"/>
+              <w:left w:type="dxa" w:w="100"/>
+              <w:bottom w:type="dxa" w:w="50"/>
+              <w:right w:type="dxa" w:w="100"/>
+            </w:tcMar>
+          </w:tcPr>
+          <w:p>
+            <w:r>
+              <w:rPr>
+                <w:sz w:val="19"/>
+                <w:szCs w:val="19"/>
+              </w:rPr>
+              <w:t xml:space="preserve">0,5 jour</w:t>
+            </w:r>
+          </w:p>
+        </w:tc>
+      </w:tr>
+      <w:tr>
+        <w:tc>
+          <w:tcPr>
+            <w:tcW w:type="dxa" w:w="5000"/>
+            <w:tcBorders>
+              <w:top w:val="single" w:color="C9D6CE" w:sz="2"/>
+              <w:left w:val="single" w:color="C9D6CE" w:sz="2"/>
+              <w:bottom w:val="single" w:color="C9D6CE" w:sz="2"/>
+              <w:right w:val="single" w:color="C9D6CE" w:sz="2"/>
+            </w:tcBorders>
+            <w:shd w:fill="E8EFEA" w:color="auto" w:val="clear"/>
+            <w:tcMar>
+              <w:top w:type="dxa" w:w="50"/>
+              <w:left w:type="dxa" w:w="100"/>
+              <w:bottom w:type="dxa" w:w="50"/>
+              <w:right w:type="dxa" w:w="100"/>
+            </w:tcMar>
+          </w:tcPr>
+          <w:p>
+            <w:r>
+              <w:rPr>
+                <w:sz w:val="19"/>
+                <w:szCs w:val="19"/>
+              </w:rPr>
+              <w:t xml:space="preserve">Forfait maintenance préventive + corrective</w:t>
+            </w:r>
+          </w:p>
+        </w:tc>
+        <w:tc>
+          <w:tcPr>
+            <w:tcW w:type="dxa" w:w="4026"/>
+            <w:tcBorders>
+              <w:top w:val="single" w:color="C9D6CE" w:sz="2"/>
+              <w:left w:val="single" w:color="C9D6CE" w:sz="2"/>
+              <w:bottom w:val="single" w:color="C9D6CE" w:sz="2"/>
+              <w:right w:val="single" w:color="C9D6CE" w:sz="2"/>
+            </w:tcBorders>
+            <w:shd w:fill="E8EFEA" w:color="auto" w:val="clear"/>
+            <w:tcMar>
+              <w:top w:type="dxa" w:w="50"/>
+              <w:left w:type="dxa" w:w="100"/>
+              <w:bottom w:type="dxa" w:w="50"/>
+              <w:right w:type="dxa" w:w="100"/>
+            </w:tcMar>
+          </w:tcPr>
+          <w:p>
+            <w:r>
+              <w:rPr>
+                <w:sz w:val="19"/>
+                <w:szCs w:val="19"/>
+              </w:rPr>
+              <w:t xml:space="preserve">350 € HT / mois</w:t>
+            </w:r>
+          </w:p>
+        </w:tc>
+      </w:tr>
+    </w:tbl>
+    <w:p>
+      <w:pPr>
+        <w:spacing w:after="120" w:line="276"/>
+      </w:pPr>
+      <w:r>
+        <w:rPr>
+          <w:b/>
+          <w:bCs/>
+          <w:sz w:val="21"/>
+          <w:szCs w:val="21"/>
+        </w:rPr>
+        <w:t xml:space="preserve">Mode de contractualisation.</w:t>
+      </w:r>
+    </w:p>
+    <w:p>
+      <w:pPr>
+        <w:pStyle w:val="ListParagraph"/>
+        <w:numPr>
+          <w:ilvl w:val="0"/>
+          <w:numId w:val="2"/>
+        </w:numPr>
+        <w:spacing w:after="80"/>
+      </w:pPr>
+      <w:r>
+        <w:rPr>
+          <w:b/>
+          <w:bCs/>
+          <w:sz w:val="21"/>
+          <w:szCs w:val="21"/>
+        </w:rPr>
+        <w:t xml:space="preserve">1. </w:t>
+      </w:r>
+      <w:r>
+        <w:rPr>
+          <w:sz w:val="21"/>
+          <w:szCs w:val="21"/>
+        </w:rPr>
+        <w:t xml:space="preserve">Le besoin est formalisé par une issue GitHub (modèle « Fonctionnalité »), avec ses critères d'acceptation.</w:t>
+      </w:r>
+    </w:p>
+    <w:p>
+      <w:pPr>
+        <w:pStyle w:val="ListParagraph"/>
+        <w:numPr>
+          <w:ilvl w:val="0"/>
+          <w:numId w:val="2"/>
+        </w:numPr>
+        <w:spacing w:after="80"/>
+      </w:pPr>
+      <w:r>
+        <w:rPr>
+          <w:b/>
+          <w:bCs/>
+          <w:sz w:val="21"/>
+          <w:szCs w:val="21"/>
+        </w:rPr>
+        <w:t xml:space="preserve">2. </w:t>
+      </w:r>
+      <w:r>
+        <w:rPr>
+          <w:sz w:val="21"/>
+          <w:szCs w:val="21"/>
+        </w:rPr>
+        <w:t xml:space="preserve">Un chiffrage en jours-homme est produit et soumis au client.</w:t>
+      </w:r>
+    </w:p>
+    <w:p>
+      <w:pPr>
+        <w:pStyle w:val="ListParagraph"/>
+        <w:numPr>
+          <w:ilvl w:val="0"/>
+          <w:numId w:val="2"/>
+        </w:numPr>
+        <w:spacing w:after="80"/>
+      </w:pPr>
+      <w:r>
+        <w:rPr>
+          <w:b/>
+          <w:bCs/>
+          <w:sz w:val="21"/>
+          <w:szCs w:val="21"/>
+        </w:rPr>
+        <w:t xml:space="preserve">3. </w:t>
+      </w:r>
+      <w:r>
+        <w:rPr>
+          <w:sz w:val="21"/>
+          <w:szCs w:val="21"/>
+        </w:rPr>
+        <w:t xml:space="preserve">Après validation écrite (bon de commande), la tâche est affectée à une milestone.</w:t>
+      </w:r>
+    </w:p>
+    <w:p>
+      <w:pPr>
+        <w:pStyle w:val="ListParagraph"/>
+        <w:numPr>
+          <w:ilvl w:val="0"/>
+          <w:numId w:val="2"/>
+        </w:numPr>
+        <w:spacing w:after="80"/>
+      </w:pPr>
+      <w:r>
+        <w:rPr>
+          <w:b/>
+          <w:bCs/>
+          <w:sz w:val="21"/>
+          <w:szCs w:val="21"/>
+        </w:rPr>
+        <w:t xml:space="preserve">4. </w:t>
+      </w:r>
+      <w:r>
+        <w:rPr>
+          <w:sz w:val="21"/>
+          <w:szCs w:val="21"/>
+        </w:rPr>
+        <w:t xml:space="preserve">La livraison suit le processus standard : branche dédiée, pull request, CI verte, revue, merge, déploiement.</w:t>
+      </w:r>
+    </w:p>
+    <w:p>
+      <w:pPr>
+        <w:pStyle w:val="ListParagraph"/>
+        <w:numPr>
+          <w:ilvl w:val="0"/>
+          <w:numId w:val="2"/>
+        </w:numPr>
+        <w:spacing w:after="80"/>
+      </w:pPr>
+      <w:r>
+        <w:rPr>
+          <w:b/>
+          <w:bCs/>
+          <w:sz w:val="21"/>
+          <w:szCs w:val="21"/>
+        </w:rPr>
+        <w:t xml:space="preserve">5. </w:t>
+      </w:r>
+      <w:r>
+        <w:rPr>
+          <w:sz w:val="21"/>
+          <w:szCs w:val="21"/>
+        </w:rPr>
+        <w:t xml:space="preserve">La recette est prononcée par le client sur la base des critères d'acceptation de l'issue.</w:t>
+      </w:r>
+    </w:p>
+    <w:p>
+      <w:pPr>
+        <w:spacing w:after="120" w:line="276"/>
+      </w:pPr>
+      <w:r>
+        <w:rPr>
+          <w:sz w:val="21"/>
+          <w:szCs w:val="21"/>
+        </w:rPr>
+        <w:t xml:space="preserve">Le contrat de maintenance est conclu pour une durée de </w:t>
+      </w:r>
+      <w:r>
+        <w:rPr>
+          <w:b/>
+          <w:bCs/>
+          <w:sz w:val="21"/>
+          <w:szCs w:val="21"/>
+        </w:rPr>
+        <w:t xml:space="preserve">12 mois</w:t>
+      </w:r>
+      <w:r>
+        <w:rPr>
+          <w:sz w:val="21"/>
+          <w:szCs w:val="21"/>
+        </w:rPr>
+        <w:t xml:space="preserve">, reconductible tacitement, résiliable avec un préavis de 2 mois. Les évolutions sont priorisées conjointement lors d'un comité de pilotage trimestriel.</w:t>
+      </w:r>
+    </w:p>
+    <w:p>
+      <w:pPr>
+        <w:spacing w:after="120" w:line="276"/>
+      </w:pPr>
+      <w:r>
+        <w:rPr>
+          <w:i/>
+          <w:iCs/>
+          <w:color w:val="777777"/>
+          <w:sz w:val="20"/>
+          <w:szCs w:val="20"/>
+        </w:rPr>
+        <w:t xml:space="preserve">Les montants ci-dessus sont donnés à titre d'hypothèse pédagogique et n'engagent aucune partie.</w:t>
       </w:r>
     </w:p>
     <w:p>

</xml_diff>